<commit_message>
Update report leader and generate PDF
</commit_message>
<xml_diff>
--- a/reports/实验报告.docx
+++ b/reports/实验报告.docx
@@ -355,16 +355,8 @@
             <w:vAlign w:val="center"/>
           </w:tcPr>
           <w:p>
-            <w:pPr>
-              <w:spacing w:after="0"/>
-            </w:pPr>
-            <w:r/>
             <w:r>
-              <w:rPr>
-                <w:b w:val="0"/>
-                <w:sz w:val="18"/>
-              </w:rPr>
-              <w:t>组长</w:t>
+              <w:t>组员</w:t>
             </w:r>
           </w:p>
         </w:tc>
@@ -374,15 +366,7 @@
             <w:vAlign w:val="center"/>
           </w:tcPr>
           <w:p>
-            <w:pPr>
-              <w:spacing w:after="0"/>
-            </w:pPr>
-            <w:r/>
             <w:r>
-              <w:rPr>
-                <w:b w:val="0"/>
-                <w:sz w:val="18"/>
-              </w:rPr>
               <w:t>邹传涛</w:t>
             </w:r>
           </w:p>
@@ -393,15 +377,7 @@
             <w:vAlign w:val="center"/>
           </w:tcPr>
           <w:p>
-            <w:pPr>
-              <w:spacing w:after="0"/>
-            </w:pPr>
-            <w:r/>
             <w:r>
-              <w:rPr>
-                <w:b w:val="0"/>
-                <w:sz w:val="18"/>
-              </w:rPr>
               <w:t>37220232203970</w:t>
             </w:r>
           </w:p>
@@ -412,16 +388,8 @@
             <w:vAlign w:val="center"/>
           </w:tcPr>
           <w:p>
-            <w:pPr>
-              <w:spacing w:after="0"/>
-            </w:pPr>
-            <w:r/>
             <w:r>
-              <w:rPr>
-                <w:b w:val="0"/>
-                <w:sz w:val="18"/>
-              </w:rPr>
-              <w:t>总体统筹、环境搭建、报告整合、提交材料检查</w:t>
+              <w:t>环境搭建、报告整合、提交材料检查</w:t>
             </w:r>
           </w:p>
         </w:tc>
@@ -433,16 +401,8 @@
             <w:vAlign w:val="center"/>
           </w:tcPr>
           <w:p>
-            <w:pPr>
-              <w:spacing w:after="0"/>
-            </w:pPr>
-            <w:r/>
             <w:r>
-              <w:rPr>
-                <w:b w:val="0"/>
-                <w:sz w:val="18"/>
-              </w:rPr>
-              <w:t>组员</w:t>
+              <w:t>组长</w:t>
             </w:r>
           </w:p>
         </w:tc>
@@ -452,15 +412,7 @@
             <w:vAlign w:val="center"/>
           </w:tcPr>
           <w:p>
-            <w:pPr>
-              <w:spacing w:after="0"/>
-            </w:pPr>
-            <w:r/>
             <w:r>
-              <w:rPr>
-                <w:b w:val="0"/>
-                <w:sz w:val="18"/>
-              </w:rPr>
               <w:t>何后天</w:t>
             </w:r>
           </w:p>
@@ -471,15 +423,7 @@
             <w:vAlign w:val="center"/>
           </w:tcPr>
           <w:p>
-            <w:pPr>
-              <w:spacing w:after="0"/>
-            </w:pPr>
-            <w:r/>
             <w:r>
-              <w:rPr>
-                <w:b w:val="0"/>
-                <w:sz w:val="18"/>
-              </w:rPr>
               <w:t>37220232203673</w:t>
             </w:r>
           </w:p>
@@ -490,16 +434,8 @@
             <w:vAlign w:val="center"/>
           </w:tcPr>
           <w:p>
-            <w:pPr>
-              <w:spacing w:after="0"/>
-            </w:pPr>
-            <w:r/>
             <w:r>
-              <w:rPr>
-                <w:b w:val="0"/>
-                <w:sz w:val="18"/>
-              </w:rPr>
-              <w:t>数据获取、pandas 清洗、SQLite 建库与验证查询</w:t>
+              <w:t>项目统筹、数据获取、pandas 清洗、SQLite 建库与验证查询</w:t>
             </w:r>
           </w:p>
         </w:tc>
@@ -511,15 +447,7 @@
             <w:vAlign w:val="center"/>
           </w:tcPr>
           <w:p>
-            <w:pPr>
-              <w:spacing w:after="0"/>
-            </w:pPr>
-            <w:r/>
             <w:r>
-              <w:rPr>
-                <w:b w:val="0"/>
-                <w:sz w:val="18"/>
-              </w:rPr>
               <w:t>组员</w:t>
             </w:r>
           </w:p>
@@ -530,15 +458,7 @@
             <w:vAlign w:val="center"/>
           </w:tcPr>
           <w:p>
-            <w:pPr>
-              <w:spacing w:after="0"/>
-            </w:pPr>
-            <w:r/>
             <w:r>
-              <w:rPr>
-                <w:b w:val="0"/>
-                <w:sz w:val="18"/>
-              </w:rPr>
               <w:t>彭泽喜</w:t>
             </w:r>
           </w:p>
@@ -549,15 +469,7 @@
             <w:vAlign w:val="center"/>
           </w:tcPr>
           <w:p>
-            <w:pPr>
-              <w:spacing w:after="0"/>
-            </w:pPr>
-            <w:r/>
             <w:r>
-              <w:rPr>
-                <w:b w:val="0"/>
-                <w:sz w:val="18"/>
-              </w:rPr>
               <w:t>37220232203792</w:t>
             </w:r>
           </w:p>
@@ -568,15 +480,7 @@
             <w:vAlign w:val="center"/>
           </w:tcPr>
           <w:p>
-            <w:pPr>
-              <w:spacing w:after="0"/>
-            </w:pPr>
-            <w:r/>
             <w:r>
-              <w:rPr>
-                <w:b w:val="0"/>
-                <w:sz w:val="18"/>
-              </w:rPr>
               <w:t>LangChain Data Agent、DeepSeek API 接入、Streamlit 可视化</w:t>
             </w:r>
           </w:p>

</xml_diff>

<commit_message>
Add report runtime screenshots
</commit_message>
<xml_diff>
--- a/reports/实验报告.docx
+++ b/reports/实验报告.docx
@@ -7117,13 +7117,131 @@
       </w:tr>
     </w:tbl>
     <w:p/>
-    <w:sectPr>
-      <w:footerReference w:type="default" r:id="rId9"/>
-      <w:pgSz w:w="12240" w:h="15840"/>
-      <w:pgMar w:top="1440" w:right="1440" w:bottom="1440" w:left="1440" w:header="708" w:footer="708" w:gutter="0"/>
-      <w:cols w:space="720"/>
-      <w:docGrid w:linePitch="360"/>
-    </w:sectPr>
+    <w:p>
+      <w:r>
+        <w:br w:type="page"/>
+      </w:r>
+    </w:p>
+    <w:p>
+      <w:r>
+        <w:br w:type="page"/>
+      </w:r>
+    </w:p>
+    <w:p>
+      <w:pPr>
+        <w:pStyle w:val="Heading1"/>
+      </w:pPr>
+      <w:r>
+        <w:t>附录 B：运行截图</w:t>
+      </w:r>
+    </w:p>
+    <w:p>
+      <w:r>
+        <w:t>以下截图用于证明项目可以在本地环境实际运行。图表截图已在正文“Streamlit 界面与可视化”部分展示，本附录补充烟雾测试和 DeepSeek Agent 端到端查询链路截图。</w:t>
+      </w:r>
+    </w:p>
+    <w:p>
+      <w:pPr>
+        <w:jc w:val="center"/>
+      </w:pPr>
+      <w:r>
+        <w:drawing>
+          <wp:inline xmlns:a="http://schemas.openxmlformats.org/drawingml/2006/main" xmlns:pic="http://schemas.openxmlformats.org/drawingml/2006/picture">
+            <wp:extent cx="5669280" cy="1095550"/>
+            <wp:docPr id="4" name="Picture 4"/>
+            <wp:cNvGraphicFramePr>
+              <a:graphicFrameLocks noChangeAspect="1"/>
+            </wp:cNvGraphicFramePr>
+            <a:graphic>
+              <a:graphicData uri="http://schemas.openxmlformats.org/drawingml/2006/picture">
+                <pic:pic>
+                  <pic:nvPicPr>
+                    <pic:cNvPr id="0" name="smoke_test_output.png"/>
+                    <pic:cNvPicPr/>
+                  </pic:nvPicPr>
+                  <pic:blipFill>
+                    <a:blip r:embed="rId15"/>
+                    <a:stretch>
+                      <a:fillRect/>
+                    </a:stretch>
+                  </pic:blipFill>
+                  <pic:spPr>
+                    <a:xfrm>
+                      <a:off x="0" y="0"/>
+                      <a:ext cx="5669280" cy="1095550"/>
+                    </a:xfrm>
+                    <a:prstGeom prst="rect"/>
+                  </pic:spPr>
+                </pic:pic>
+              </a:graphicData>
+            </a:graphic>
+          </wp:inline>
+        </w:drawing>
+      </w:r>
+    </w:p>
+    <w:p>
+      <w:pPr>
+        <w:jc w:val="center"/>
+      </w:pPr>
+      <w:r>
+        <w:rPr>
+          <w:color w:val="595959"/>
+          <w:sz w:val="18"/>
+        </w:rPr>
+        <w:t>图 B-1 本地烟雾测试运行截图。截图显示依赖导入、数据库表数量、比赛数量和 SQL 安全检查均通过。</w:t>
+      </w:r>
+    </w:p>
+    <w:p>
+      <w:pPr>
+        <w:jc w:val="center"/>
+      </w:pPr>
+      <w:r>
+        <w:drawing>
+          <wp:inline xmlns:a="http://schemas.openxmlformats.org/drawingml/2006/main" xmlns:pic="http://schemas.openxmlformats.org/drawingml/2006/picture">
+            <wp:extent cx="5669280" cy="4428167"/>
+            <wp:docPr id="5" name="Picture 5"/>
+            <wp:cNvGraphicFramePr>
+              <a:graphicFrameLocks noChangeAspect="1"/>
+            </wp:cNvGraphicFramePr>
+            <a:graphic>
+              <a:graphicData uri="http://schemas.openxmlformats.org/drawingml/2006/picture">
+                <pic:pic>
+                  <pic:nvPicPr>
+                    <pic:cNvPr id="0" name="deepseek_agent_output.png"/>
+                    <pic:cNvPicPr/>
+                  </pic:nvPicPr>
+                  <pic:blipFill>
+                    <a:blip r:embed="rId16"/>
+                    <a:stretch>
+                      <a:fillRect/>
+                    </a:stretch>
+                  </pic:blipFill>
+                  <pic:spPr>
+                    <a:xfrm>
+                      <a:off x="0" y="0"/>
+                      <a:ext cx="5669280" cy="4428167"/>
+                    </a:xfrm>
+                    <a:prstGeom prst="rect"/>
+                  </pic:spPr>
+                </pic:pic>
+              </a:graphicData>
+            </a:graphic>
+          </wp:inline>
+        </w:drawing>
+      </w:r>
+    </w:p>
+    <w:p>
+      <w:pPr>
+        <w:jc w:val="center"/>
+      </w:pPr>
+      <w:r>
+        <w:rPr>
+          <w:color w:val="595959"/>
+          <w:sz w:val="18"/>
+        </w:rPr>
+        <w:t>图 B-2 DeepSeek Agent 自然语言查询运行截图。截图显示系统生成只读 SQL、执行查询并返回中文分析结论。</w:t>
+      </w:r>
+    </w:p>
   </w:body>
 </w:document>
 </file>

</xml_diff>